<commit_message>
chore: remove raw input photos and update final reports
</commit_message>
<xml_diff>
--- a/reports/practice_report.docx
+++ b/reports/practice_report.docx
@@ -10,8 +10,8 @@
         <w:rPr>
           <w:rFonts w:ascii="Times New Roman" w:eastAsia="Times New Roman" w:hAnsi="Times New Roman" w:cs="Times New Roman"/>
           <w:color w:val="000000"/>
-          <w:sz w:val="24"/>
-          <w:szCs w:val="24"/>
+          <w:sz w:val="28"/>
+          <w:szCs w:val="28"/>
           <w:lang w:eastAsia="en-US" w:bidi="en-US"/>
         </w:rPr>
       </w:pPr>
@@ -19,8 +19,8 @@
         <w:rPr>
           <w:rFonts w:ascii="Times New Roman" w:eastAsia="Times New Roman" w:hAnsi="Times New Roman" w:cs="Times New Roman"/>
           <w:color w:val="000000"/>
-          <w:sz w:val="24"/>
-          <w:szCs w:val="24"/>
+          <w:sz w:val="28"/>
+          <w:szCs w:val="28"/>
           <w:lang w:eastAsia="en-US" w:bidi="en-US"/>
         </w:rPr>
         <w:t>Федеральное государственное автономное образовательное учреждение высшего образования</w:t>
@@ -34,8 +34,8 @@
         <w:rPr>
           <w:rFonts w:ascii="Times New Roman" w:eastAsia="Times New Roman" w:hAnsi="Times New Roman" w:cs="Times New Roman"/>
           <w:color w:val="000000"/>
-          <w:sz w:val="24"/>
-          <w:szCs w:val="24"/>
+          <w:sz w:val="28"/>
+          <w:szCs w:val="28"/>
           <w:lang w:eastAsia="en-US" w:bidi="en-US"/>
         </w:rPr>
       </w:pPr>
@@ -43,8 +43,8 @@
         <w:rPr>
           <w:rFonts w:ascii="Times New Roman" w:eastAsia="Times New Roman" w:hAnsi="Times New Roman" w:cs="Times New Roman"/>
           <w:color w:val="000000"/>
-          <w:sz w:val="24"/>
-          <w:szCs w:val="24"/>
+          <w:sz w:val="28"/>
+          <w:szCs w:val="28"/>
           <w:lang w:eastAsia="en-US" w:bidi="en-US"/>
         </w:rPr>
         <w:t>«МОСКОВСКИЙ ПОЛИТЕХНИЧЕСКИЙ УНИВЕРСИТЕТ»</w:t>
@@ -58,8 +58,8 @@
         <w:rPr>
           <w:rFonts w:ascii="Times New Roman" w:eastAsia="Times New Roman" w:hAnsi="Times New Roman" w:cs="Times New Roman"/>
           <w:color w:val="000000"/>
-          <w:sz w:val="24"/>
-          <w:szCs w:val="24"/>
+          <w:sz w:val="28"/>
+          <w:szCs w:val="28"/>
           <w:lang w:eastAsia="en-US" w:bidi="en-US"/>
         </w:rPr>
       </w:pPr>
@@ -67,6 +67,8 @@
         <w:rPr>
           <w:rFonts w:ascii="Times New Roman" w:hAnsi="Times New Roman" w:cs="Times New Roman"/>
           <w:b/>
+          <w:sz w:val="28"/>
+          <w:szCs w:val="28"/>
         </w:rPr>
         <w:t>Факультет информационных технологий</w:t>
       </w:r>
@@ -79,8 +81,8 @@
         <w:rPr>
           <w:rFonts w:ascii="Times New Roman" w:hAnsi="Times New Roman" w:cs="Times New Roman"/>
           <w:color w:val="000000"/>
-          <w:sz w:val="24"/>
-          <w:szCs w:val="24"/>
+          <w:sz w:val="28"/>
+          <w:szCs w:val="28"/>
           <w:lang w:eastAsia="en-US" w:bidi="en-US"/>
         </w:rPr>
       </w:pPr>
@@ -88,6 +90,8 @@
         <w:rPr>
           <w:rFonts w:ascii="Times New Roman" w:hAnsi="Times New Roman" w:cs="Times New Roman"/>
           <w:b/>
+          <w:sz w:val="28"/>
+          <w:szCs w:val="28"/>
         </w:rPr>
         <w:t>Направление подготовки: 09.03.02 Информационные системы и технологии</w:t>
       </w:r>
@@ -105,6 +109,8 @@
           <w:lang w:eastAsia="en-US" w:bidi="en-US"/>
         </w:rPr>
       </w:pPr>
+      <w:bookmarkStart w:id="0" w:name="_GoBack"/>
+      <w:bookmarkEnd w:id="0"/>
     </w:p>
     <w:p>
       <w:pPr>
@@ -136,8 +142,8 @@
       <w:r>
         <w:rPr>
           <w:rFonts w:ascii="Times New Roman" w:eastAsia="Times New Roman" w:hAnsi="Times New Roman" w:cs="Times New Roman"/>
-          <w:sz w:val="44"/>
-          <w:szCs w:val="44"/>
+          <w:sz w:val="28"/>
+          <w:szCs w:val="28"/>
           <w:lang w:eastAsia="en-US" w:bidi="en-US"/>
         </w:rPr>
         <w:t>ОТЧЕТ</w:t>
@@ -168,19 +174,7 @@
           <w:szCs w:val="28"/>
           <w:lang w:eastAsia="en-US" w:bidi="en-US"/>
         </w:rPr>
-        <w:t xml:space="preserve">по </w:t>
-      </w:r>
-      <w:r>
-        <w:rPr>
-          <w:rFonts w:ascii="Times New Roman" w:eastAsia="Times New Roman" w:hAnsi="Times New Roman" w:cs="Times New Roman"/>
-          <w:bCs/>
-          <w:iCs/>
-          <w:color w:val="000000"/>
-          <w:sz w:val="28"/>
-          <w:szCs w:val="28"/>
-          <w:lang w:eastAsia="en-US" w:bidi="en-US"/>
-        </w:rPr>
-        <w:t>проектной практике</w:t>
+        <w:t>по проектной практике</w:t>
       </w:r>
     </w:p>
     <w:p>
@@ -206,6 +200,7 @@
           <w:rFonts w:ascii="Times New Roman" w:eastAsia="Times New Roman" w:hAnsi="Times New Roman" w:cs="Times New Roman"/>
           <w:color w:val="000000"/>
           <w:sz w:val="28"/>
+          <w:szCs w:val="28"/>
           <w:lang w:eastAsia="en-US" w:bidi="en-US"/>
         </w:rPr>
       </w:pPr>
@@ -213,8 +208,70 @@
         <w:rPr>
           <w:rFonts w:ascii="Times New Roman" w:hAnsi="Times New Roman" w:cs="Times New Roman"/>
           <w:b/>
-        </w:rPr>
-        <w:t>Студент: Сангаджиев Малзан Гаряевич            Группа: 251-951</w:t>
+          <w:sz w:val="28"/>
+          <w:szCs w:val="28"/>
+        </w:rPr>
+        <w:t xml:space="preserve">Студент: </w:t>
+      </w:r>
+      <w:proofErr w:type="spellStart"/>
+      <w:r>
+        <w:rPr>
+          <w:rFonts w:ascii="Times New Roman" w:hAnsi="Times New Roman" w:cs="Times New Roman"/>
+          <w:b/>
+          <w:sz w:val="28"/>
+          <w:szCs w:val="28"/>
+        </w:rPr>
+        <w:t>Сангаджиев</w:t>
+      </w:r>
+      <w:proofErr w:type="spellEnd"/>
+      <w:r>
+        <w:rPr>
+          <w:rFonts w:ascii="Times New Roman" w:hAnsi="Times New Roman" w:cs="Times New Roman"/>
+          <w:b/>
+          <w:sz w:val="28"/>
+          <w:szCs w:val="28"/>
+        </w:rPr>
+        <w:t xml:space="preserve"> </w:t>
+      </w:r>
+      <w:proofErr w:type="spellStart"/>
+      <w:r>
+        <w:rPr>
+          <w:rFonts w:ascii="Times New Roman" w:hAnsi="Times New Roman" w:cs="Times New Roman"/>
+          <w:b/>
+          <w:sz w:val="28"/>
+          <w:szCs w:val="28"/>
+        </w:rPr>
+        <w:t>Малзан</w:t>
+      </w:r>
+      <w:proofErr w:type="spellEnd"/>
+      <w:r>
+        <w:rPr>
+          <w:rFonts w:ascii="Times New Roman" w:hAnsi="Times New Roman" w:cs="Times New Roman"/>
+          <w:b/>
+          <w:sz w:val="28"/>
+          <w:szCs w:val="28"/>
+        </w:rPr>
+        <w:t xml:space="preserve"> </w:t>
+      </w:r>
+      <w:proofErr w:type="spellStart"/>
+      <w:r>
+        <w:rPr>
+          <w:rFonts w:ascii="Times New Roman" w:hAnsi="Times New Roman" w:cs="Times New Roman"/>
+          <w:b/>
+          <w:sz w:val="28"/>
+          <w:szCs w:val="28"/>
+        </w:rPr>
+        <w:t>Гаряевич</w:t>
+      </w:r>
+      <w:proofErr w:type="spellEnd"/>
+      <w:r>
+        <w:rPr>
+          <w:rFonts w:ascii="Times New Roman" w:hAnsi="Times New Roman" w:cs="Times New Roman"/>
+          <w:b/>
+          <w:sz w:val="28"/>
+          <w:szCs w:val="28"/>
+        </w:rPr>
+        <w:t xml:space="preserve">            Группа: 251-951</w:t>
       </w:r>
     </w:p>
     <w:p>
@@ -225,6 +282,7 @@
           <w:rFonts w:ascii="Times New Roman" w:eastAsia="Times New Roman" w:hAnsi="Times New Roman" w:cs="Times New Roman"/>
           <w:color w:val="000000"/>
           <w:sz w:val="28"/>
+          <w:szCs w:val="28"/>
           <w:lang w:eastAsia="en-US" w:bidi="en-US"/>
         </w:rPr>
       </w:pPr>
@@ -232,6 +290,8 @@
         <w:rPr>
           <w:rFonts w:ascii="Times New Roman" w:hAnsi="Times New Roman" w:cs="Times New Roman"/>
           <w:b/>
+          <w:sz w:val="28"/>
+          <w:szCs w:val="28"/>
         </w:rPr>
         <w:t>Место прохождения практики: Московский Политех, кафедра «Информационная безопасность»</w:t>
       </w:r>
@@ -265,6 +325,8 @@
         <w:rPr>
           <w:rFonts w:ascii="Times New Roman" w:hAnsi="Times New Roman" w:cs="Times New Roman"/>
           <w:b/>
+          <w:sz w:val="28"/>
+          <w:szCs w:val="28"/>
         </w:rPr>
         <w:t>Отчет принят с оценкой: Отлично           Дата: 19.05.202</w:t>
       </w:r>
@@ -272,11 +334,11 @@
         <w:rPr>
           <w:rFonts w:ascii="Times New Roman" w:hAnsi="Times New Roman" w:cs="Times New Roman"/>
           <w:b/>
+          <w:sz w:val="28"/>
+          <w:szCs w:val="28"/>
         </w:rPr>
         <w:t>6</w:t>
       </w:r>
-      <w:bookmarkStart w:id="0" w:name="_GoBack"/>
-      <w:bookmarkEnd w:id="0"/>
     </w:p>
     <w:p>
       <w:pPr>
@@ -294,15 +356,30 @@
         <w:rPr>
           <w:rFonts w:ascii="Times New Roman" w:hAnsi="Times New Roman" w:cs="Times New Roman"/>
           <w:b/>
-        </w:rPr>
-        <w:t xml:space="preserve">Руководитель </w:t>
-      </w:r>
+          <w:sz w:val="28"/>
+          <w:szCs w:val="28"/>
+        </w:rPr>
+        <w:t xml:space="preserve">Руководитель практики: </w:t>
+      </w:r>
+      <w:proofErr w:type="spellStart"/>
       <w:r>
         <w:rPr>
           <w:rFonts w:ascii="Times New Roman" w:hAnsi="Times New Roman" w:cs="Times New Roman"/>
           <w:b/>
-        </w:rPr>
-        <w:t>практики: Гневшев Александр Юрьевич</w:t>
+          <w:sz w:val="28"/>
+          <w:szCs w:val="28"/>
+        </w:rPr>
+        <w:t>Гневшев</w:t>
+      </w:r>
+      <w:proofErr w:type="spellEnd"/>
+      <w:r>
+        <w:rPr>
+          <w:rFonts w:ascii="Times New Roman" w:hAnsi="Times New Roman" w:cs="Times New Roman"/>
+          <w:b/>
+          <w:sz w:val="28"/>
+          <w:szCs w:val="28"/>
+        </w:rPr>
+        <w:t xml:space="preserve"> Александр Юрьевич</w:t>
       </w:r>
     </w:p>
     <w:p>
@@ -378,6 +455,7 @@
           <w:szCs w:val="28"/>
           <w:lang w:eastAsia="en-US" w:bidi="en-US"/>
         </w:rPr>
+        <w:lastRenderedPageBreak/>
         <w:t>Москва 2026</w:t>
       </w:r>
     </w:p>
@@ -401,7 +479,6 @@
           <w:sz w:val="28"/>
           <w:szCs w:val="28"/>
         </w:rPr>
-        <w:lastRenderedPageBreak/>
         <w:t>ОГЛАВЛЕНИЕ</w:t>
       </w:r>
     </w:p>
@@ -445,57 +522,51 @@
       <w:pPr>
         <w:rPr>
           <w:rFonts w:ascii="Times New Roman" w:hAnsi="Times New Roman" w:cs="Times New Roman"/>
-        </w:rPr>
-      </w:pPr>
-      <w:r>
-        <w:rPr>
-          <w:rFonts w:ascii="Times New Roman" w:hAnsi="Times New Roman" w:cs="Times New Roman"/>
-        </w:rPr>
-        <w:t>Настоящий отчет посвящен результатам прохождения учебной проектной практики группой студентов Факультета информационных технологий Московского Политеха. Практика является важным элеме</w:t>
-      </w:r>
-      <w:r>
-        <w:rPr>
-          <w:rFonts w:ascii="Times New Roman" w:hAnsi="Times New Roman" w:cs="Times New Roman"/>
-        </w:rPr>
-        <w:t>нтом подготовки специалистов, связывающим теоретические знания в области информационных технологий со спецификой социологических и прикладных исследований в образовании.</w:t>
-      </w:r>
-      <w:r>
-        <w:rPr>
-          <w:rFonts w:ascii="Times New Roman" w:hAnsi="Times New Roman" w:cs="Times New Roman"/>
+          <w:sz w:val="28"/>
+          <w:szCs w:val="28"/>
+        </w:rPr>
+      </w:pPr>
+      <w:r>
+        <w:rPr>
+          <w:rFonts w:ascii="Times New Roman" w:hAnsi="Times New Roman" w:cs="Times New Roman"/>
+          <w:sz w:val="28"/>
+          <w:szCs w:val="28"/>
+        </w:rPr>
+        <w:t>Настоящий отчет посвящен результатам прохождения учебной проектной практики группой студентов Факультета информационных технологий Московского Политеха. Практика является важным элементом подготовки специалистов, связывающим теоретические знания в области информационных технологий со спецификой социологических и прикладных исследований в образовании.</w:t>
+      </w:r>
+      <w:r>
+        <w:rPr>
+          <w:rFonts w:ascii="Times New Roman" w:hAnsi="Times New Roman" w:cs="Times New Roman"/>
+          <w:sz w:val="28"/>
+          <w:szCs w:val="28"/>
         </w:rPr>
         <w:br/>
       </w:r>
       <w:r>
         <w:rPr>
           <w:rFonts w:ascii="Times New Roman" w:hAnsi="Times New Roman" w:cs="Times New Roman"/>
+          <w:sz w:val="28"/>
+          <w:szCs w:val="28"/>
         </w:rPr>
         <w:br/>
-        <w:t>Объектом исследования является качество учебного процесса в Московском Политехе и мет</w:t>
-      </w:r>
-      <w:r>
-        <w:rPr>
-          <w:rFonts w:ascii="Times New Roman" w:hAnsi="Times New Roman" w:cs="Times New Roman"/>
-        </w:rPr>
-        <w:t>оды его оценки. Предметом исследования выступает автоматизация сбора обратной связи студентов и анализ эффективности деятельности профессорско-преподавательского состава (ППС).</w:t>
-      </w:r>
-      <w:r>
-        <w:rPr>
-          <w:rFonts w:ascii="Times New Roman" w:hAnsi="Times New Roman" w:cs="Times New Roman"/>
+        <w:t>Объектом исследования является качество учебного процесса в Московском Политехе и методы его оценки. Предметом исследования выступает автоматизация сбора обратной связи студентов и анализ эффективности деятельности профессорско-преподавательского состава (ППС).</w:t>
+      </w:r>
+      <w:r>
+        <w:rPr>
+          <w:rFonts w:ascii="Times New Roman" w:hAnsi="Times New Roman" w:cs="Times New Roman"/>
+          <w:sz w:val="28"/>
+          <w:szCs w:val="28"/>
         </w:rPr>
         <w:br/>
       </w:r>
       <w:r>
         <w:rPr>
           <w:rFonts w:ascii="Times New Roman" w:hAnsi="Times New Roman" w:cs="Times New Roman"/>
+          <w:sz w:val="28"/>
+          <w:szCs w:val="28"/>
         </w:rPr>
         <w:br/>
-        <w:t>Цель практики — разработка и внедрение автоматизированного веб-ориентированног</w:t>
-      </w:r>
-      <w:r>
-        <w:rPr>
-          <w:rFonts w:ascii="Times New Roman" w:hAnsi="Times New Roman" w:cs="Times New Roman"/>
-        </w:rPr>
-        <w:t>о программного комплекса для проведения регулярного социологического мониторинга, статистического анализа и визуализации оценок эффективности ППС.</w:t>
+        <w:t>Цель практики — разработка и внедрение автоматизированного веб-ориентированного программного комплекса для проведения регулярного социологического мониторинга, статистического анализа и визуализации оценок эффективности ППС.</w:t>
       </w:r>
     </w:p>
     <w:p>
@@ -556,19 +627,17 @@
       <w:pPr>
         <w:rPr>
           <w:rFonts w:ascii="Times New Roman" w:hAnsi="Times New Roman" w:cs="Times New Roman"/>
-        </w:rPr>
-      </w:pPr>
-      <w:r>
-        <w:rPr>
-          <w:rFonts w:ascii="Times New Roman" w:hAnsi="Times New Roman" w:cs="Times New Roman"/>
-        </w:rPr>
-        <w:t>Социологический мониторинг и анализ оценки эффективности професс</w:t>
-      </w:r>
-      <w:r>
-        <w:rPr>
-          <w:rFonts w:ascii="Times New Roman" w:hAnsi="Times New Roman" w:cs="Times New Roman"/>
-        </w:rPr>
-        <w:t>орско-преподавательского состава (ППС).</w:t>
+          <w:sz w:val="28"/>
+          <w:szCs w:val="28"/>
+        </w:rPr>
+      </w:pPr>
+      <w:r>
+        <w:rPr>
+          <w:rFonts w:ascii="Times New Roman" w:hAnsi="Times New Roman" w:cs="Times New Roman"/>
+          <w:sz w:val="28"/>
+          <w:szCs w:val="28"/>
+        </w:rPr>
+        <w:t>Социологический мониторинг и анализ оценки эффективности профессорско-преподавательского состава (ППС).</w:t>
       </w:r>
     </w:p>
     <w:p>
@@ -602,23 +671,23 @@
       <w:pPr>
         <w:rPr>
           <w:rFonts w:ascii="Times New Roman" w:hAnsi="Times New Roman" w:cs="Times New Roman"/>
-        </w:rPr>
-      </w:pPr>
-      <w:r>
-        <w:rPr>
-          <w:rFonts w:ascii="Times New Roman" w:hAnsi="Times New Roman" w:cs="Times New Roman"/>
-        </w:rPr>
-        <w:t xml:space="preserve">Целью проекта является создание удобного цифрового инструмента для анонимного анкетирования студентов и последующего статистического анализа удовлетворенности качеством </w:t>
-      </w:r>
-      <w:r>
-        <w:rPr>
-          <w:rFonts w:ascii="Times New Roman" w:hAnsi="Times New Roman" w:cs="Times New Roman"/>
-        </w:rPr>
-        <w:t>преподавания. Задачи проекта включают:</w:t>
-      </w:r>
-      <w:r>
-        <w:rPr>
-          <w:rFonts w:ascii="Times New Roman" w:hAnsi="Times New Roman" w:cs="Times New Roman"/>
+          <w:sz w:val="28"/>
+          <w:szCs w:val="28"/>
+        </w:rPr>
+      </w:pPr>
+      <w:r>
+        <w:rPr>
+          <w:rFonts w:ascii="Times New Roman" w:hAnsi="Times New Roman" w:cs="Times New Roman"/>
+          <w:sz w:val="28"/>
+          <w:szCs w:val="28"/>
+        </w:rPr>
+        <w:t>Целью проекта является создание удобного цифрового инструмента для анонимного анкетирования студентов и последующего статистического анализа удовлетворенности качеством преподавания. Задачи проекта включают:</w:t>
+      </w:r>
+      <w:r>
+        <w:rPr>
+          <w:rFonts w:ascii="Times New Roman" w:hAnsi="Times New Roman" w:cs="Times New Roman"/>
+          <w:sz w:val="28"/>
+          <w:szCs w:val="28"/>
         </w:rPr>
         <w:br/>
         <w:t>1. Формирование научно обоснованной социологической методологии опроса.</w:t>
@@ -626,6 +695,8 @@
       <w:r>
         <w:rPr>
           <w:rFonts w:ascii="Times New Roman" w:hAnsi="Times New Roman" w:cs="Times New Roman"/>
+          <w:sz w:val="28"/>
+          <w:szCs w:val="28"/>
         </w:rPr>
         <w:br/>
         <w:t>2. Проектирование схемы базы данных для хранения профилей участников образовательного процесса.</w:t>
@@ -633,26 +704,62 @@
       <w:r>
         <w:rPr>
           <w:rFonts w:ascii="Times New Roman" w:hAnsi="Times New Roman" w:cs="Times New Roman"/>
+          <w:sz w:val="28"/>
+          <w:szCs w:val="28"/>
         </w:rPr>
         <w:br/>
-        <w:t>3. Разработка современного веб-интерфейса дашборд</w:t>
-      </w:r>
-      <w:r>
-        <w:rPr>
-          <w:rFonts w:ascii="Times New Roman" w:hAnsi="Times New Roman" w:cs="Times New Roman"/>
-        </w:rPr>
-        <w:t>а для визуализации результатов аналитики.</w:t>
-      </w:r>
-      <w:r>
-        <w:rPr>
-          <w:rFonts w:ascii="Times New Roman" w:hAnsi="Times New Roman" w:cs="Times New Roman"/>
+        <w:t xml:space="preserve">3. Разработка современного веб-интерфейса </w:t>
+      </w:r>
+      <w:proofErr w:type="spellStart"/>
+      <w:r>
+        <w:rPr>
+          <w:rFonts w:ascii="Times New Roman" w:hAnsi="Times New Roman" w:cs="Times New Roman"/>
+          <w:sz w:val="28"/>
+          <w:szCs w:val="28"/>
+        </w:rPr>
+        <w:t>дашборда</w:t>
+      </w:r>
+      <w:proofErr w:type="spellEnd"/>
+      <w:r>
+        <w:rPr>
+          <w:rFonts w:ascii="Times New Roman" w:hAnsi="Times New Roman" w:cs="Times New Roman"/>
+          <w:sz w:val="28"/>
+          <w:szCs w:val="28"/>
+        </w:rPr>
+        <w:t xml:space="preserve"> для визуализации результатов аналитики.</w:t>
+      </w:r>
+      <w:r>
+        <w:rPr>
+          <w:rFonts w:ascii="Times New Roman" w:hAnsi="Times New Roman" w:cs="Times New Roman"/>
+          <w:sz w:val="28"/>
+          <w:szCs w:val="28"/>
         </w:rPr>
         <w:br/>
-        <w:t>4. Создание высокопроизводительного HTTP-сервера на языке Python с нуля.</w:t>
-      </w:r>
-      <w:r>
-        <w:rPr>
-          <w:rFonts w:ascii="Times New Roman" w:hAnsi="Times New Roman" w:cs="Times New Roman"/>
+        <w:t xml:space="preserve">4. Создание высокопроизводительного HTTP-сервера на языке </w:t>
+      </w:r>
+      <w:proofErr w:type="spellStart"/>
+      <w:r>
+        <w:rPr>
+          <w:rFonts w:ascii="Times New Roman" w:hAnsi="Times New Roman" w:cs="Times New Roman"/>
+          <w:sz w:val="28"/>
+          <w:szCs w:val="28"/>
+        </w:rPr>
+        <w:t>Python</w:t>
+      </w:r>
+      <w:proofErr w:type="spellEnd"/>
+      <w:r>
+        <w:rPr>
+          <w:rFonts w:ascii="Times New Roman" w:hAnsi="Times New Roman" w:cs="Times New Roman"/>
+          <w:sz w:val="28"/>
+          <w:szCs w:val="28"/>
+        </w:rPr>
+        <w:t xml:space="preserve"> с нуля.</w:t>
+      </w:r>
+      <w:r>
+        <w:rPr>
+          <w:rFonts w:ascii="Times New Roman" w:hAnsi="Times New Roman" w:cs="Times New Roman"/>
+          <w:sz w:val="28"/>
+          <w:szCs w:val="28"/>
         </w:rPr>
         <w:br/>
         <w:t>5. Проведение пилотного тестирования и подготовка итоговой документации.</w:t>
@@ -682,6 +789,7 @@
           <w:sz w:val="28"/>
           <w:szCs w:val="28"/>
         </w:rPr>
+        <w:lastRenderedPageBreak/>
         <w:t xml:space="preserve">Общая характеристика деятельности организации </w:t>
       </w:r>
       <w:r>
@@ -719,27 +827,22 @@
           <w:sz w:val="28"/>
           <w:szCs w:val="28"/>
         </w:rPr>
-        <w:t>На</w:t>
-      </w:r>
-      <w:r>
-        <w:rPr>
-          <w:rFonts w:ascii="Times New Roman" w:eastAsia="Times New Roman" w:hAnsi="Times New Roman" w:cs="Times New Roman"/>
-          <w:color w:val="000000"/>
-          <w:sz w:val="28"/>
-          <w:szCs w:val="28"/>
-        </w:rPr>
-        <w:t>именование заказчика</w:t>
-      </w:r>
-    </w:p>
-    <w:p>
-      <w:pPr>
-        <w:rPr>
-          <w:rFonts w:ascii="Times New Roman" w:hAnsi="Times New Roman" w:cs="Times New Roman"/>
-        </w:rPr>
-      </w:pPr>
-      <w:r>
-        <w:rPr>
-          <w:rFonts w:ascii="Times New Roman" w:hAnsi="Times New Roman" w:cs="Times New Roman"/>
+        <w:t>Наименование заказчика</w:t>
+      </w:r>
+    </w:p>
+    <w:p>
+      <w:pPr>
+        <w:rPr>
+          <w:rFonts w:ascii="Times New Roman" w:hAnsi="Times New Roman" w:cs="Times New Roman"/>
+          <w:sz w:val="28"/>
+          <w:szCs w:val="28"/>
+        </w:rPr>
+      </w:pPr>
+      <w:r>
+        <w:rPr>
+          <w:rFonts w:ascii="Times New Roman" w:hAnsi="Times New Roman" w:cs="Times New Roman"/>
+          <w:sz w:val="28"/>
+          <w:szCs w:val="28"/>
         </w:rPr>
         <w:t>Федеральное государственное автономное образовательное учреждение высшего образования «Московский политехнический университет» (Московский Политех).</w:t>
       </w:r>
@@ -775,25 +878,17 @@
       <w:pPr>
         <w:rPr>
           <w:rFonts w:ascii="Times New Roman" w:hAnsi="Times New Roman" w:cs="Times New Roman"/>
-        </w:rPr>
-      </w:pPr>
-      <w:r>
-        <w:rPr>
-          <w:rFonts w:ascii="Times New Roman" w:hAnsi="Times New Roman" w:cs="Times New Roman"/>
-        </w:rPr>
-        <w:t>Заказчик имеет классическую для крупного вуза структуру: рек</w:t>
-      </w:r>
-      <w:r>
-        <w:rPr>
-          <w:rFonts w:ascii="Times New Roman" w:hAnsi="Times New Roman" w:cs="Times New Roman"/>
-        </w:rPr>
-        <w:t>торат, дирекции институтов, деканаты факультетов и профильные выпускающие кафедры. Управление качеством образования контролируется учебно-методическим управлением и кафедрами, которые используют результаты социологических мониторингов для аттестации препод</w:t>
-      </w:r>
-      <w:r>
-        <w:rPr>
-          <w:rFonts w:ascii="Times New Roman" w:hAnsi="Times New Roman" w:cs="Times New Roman"/>
-        </w:rPr>
-        <w:t>авателей.</w:t>
+          <w:sz w:val="28"/>
+          <w:szCs w:val="28"/>
+        </w:rPr>
+      </w:pPr>
+      <w:r>
+        <w:rPr>
+          <w:rFonts w:ascii="Times New Roman" w:hAnsi="Times New Roman" w:cs="Times New Roman"/>
+          <w:sz w:val="28"/>
+          <w:szCs w:val="28"/>
+        </w:rPr>
+        <w:t>Заказчик имеет классическую для крупного вуза структуру: ректорат, дирекции институтов, деканаты факультетов и профильные выпускающие кафедры. Управление качеством образования контролируется учебно-методическим управлением и кафедрами, которые используют результаты социологических мониторингов для аттестации преподавателей.</w:t>
       </w:r>
     </w:p>
     <w:p>
@@ -820,7 +915,6 @@
           <w:sz w:val="28"/>
           <w:szCs w:val="28"/>
         </w:rPr>
-        <w:lastRenderedPageBreak/>
         <w:t>Описание деятельности</w:t>
       </w:r>
     </w:p>
@@ -828,19 +922,17 @@
       <w:pPr>
         <w:rPr>
           <w:rFonts w:ascii="Times New Roman" w:hAnsi="Times New Roman" w:cs="Times New Roman"/>
-        </w:rPr>
-      </w:pPr>
-      <w:r>
-        <w:rPr>
-          <w:rFonts w:ascii="Times New Roman" w:hAnsi="Times New Roman" w:cs="Times New Roman"/>
-        </w:rPr>
-        <w:t>Московский Политех ведет образовательную деятельность по программам бакалавриата, специалитета, магистратуры и аспирантуры. Важнейшей особенностью учебного процесса является проектное обучение, в рамках которого студенты с п</w:t>
-      </w:r>
-      <w:r>
-        <w:rPr>
-          <w:rFonts w:ascii="Times New Roman" w:hAnsi="Times New Roman" w:cs="Times New Roman"/>
-        </w:rPr>
-        <w:t>ервого курса работают над реальными задачами индустриальных партнеров под руководством кураторов и преподавателей.</w:t>
+          <w:sz w:val="28"/>
+          <w:szCs w:val="28"/>
+        </w:rPr>
+      </w:pPr>
+      <w:r>
+        <w:rPr>
+          <w:rFonts w:ascii="Times New Roman" w:hAnsi="Times New Roman" w:cs="Times New Roman"/>
+          <w:sz w:val="28"/>
+          <w:szCs w:val="28"/>
+        </w:rPr>
+        <w:t>Московский Политех ведет образовательную деятельность по программам бакалавриата, специалитета, магистратуры и аспирантуры. Важнейшей особенностью учебного процесса является проектное обучение, в рамках которого студенты с первого курса работают над реальными задачами индустриальных партнеров под руководством кураторов и преподавателей.</w:t>
       </w:r>
     </w:p>
     <w:p>
@@ -874,25 +966,107 @@
       <w:pPr>
         <w:rPr>
           <w:rFonts w:ascii="Times New Roman" w:hAnsi="Times New Roman" w:cs="Times New Roman"/>
-        </w:rPr>
-      </w:pPr>
-      <w:r>
-        <w:rPr>
-          <w:rFonts w:ascii="Times New Roman" w:hAnsi="Times New Roman" w:cs="Times New Roman"/>
-        </w:rPr>
-        <w:t>Задание на проектную практику состояло из обязательной части (настройка Git-окружения, создание задач</w:t>
-      </w:r>
-      <w:r>
-        <w:rPr>
-          <w:rFonts w:ascii="Times New Roman" w:hAnsi="Times New Roman" w:cs="Times New Roman"/>
-        </w:rPr>
-        <w:t xml:space="preserve"> на GitVerse, написание документации проекта в Markdown, разработка адаптивного веб-сайта, прохождение онлайн-курсов по LLM, участие в Карьерном марафоне и конференции DataFest 2026) и вариативной части по выбору. В качестве вариативной части было выбрано </w:t>
-      </w:r>
-      <w:r>
-        <w:rPr>
-          <w:rFonts w:ascii="Times New Roman" w:hAnsi="Times New Roman" w:cs="Times New Roman"/>
-        </w:rPr>
-        <w:t>задание 2.2 — практическая реализация технологии HTTP-сервера «с нуля» на языке Python.</w:t>
+          <w:sz w:val="28"/>
+          <w:szCs w:val="28"/>
+        </w:rPr>
+      </w:pPr>
+      <w:r>
+        <w:rPr>
+          <w:rFonts w:ascii="Times New Roman" w:hAnsi="Times New Roman" w:cs="Times New Roman"/>
+          <w:sz w:val="28"/>
+          <w:szCs w:val="28"/>
+        </w:rPr>
+        <w:t xml:space="preserve">Задание на проектную практику состояло из обязательной части (настройка </w:t>
+      </w:r>
+      <w:proofErr w:type="spellStart"/>
+      <w:r>
+        <w:rPr>
+          <w:rFonts w:ascii="Times New Roman" w:hAnsi="Times New Roman" w:cs="Times New Roman"/>
+          <w:sz w:val="28"/>
+          <w:szCs w:val="28"/>
+        </w:rPr>
+        <w:t>Git</w:t>
+      </w:r>
+      <w:proofErr w:type="spellEnd"/>
+      <w:r>
+        <w:rPr>
+          <w:rFonts w:ascii="Times New Roman" w:hAnsi="Times New Roman" w:cs="Times New Roman"/>
+          <w:sz w:val="28"/>
+          <w:szCs w:val="28"/>
+        </w:rPr>
+        <w:t xml:space="preserve">-окружения, создание задач на </w:t>
+      </w:r>
+      <w:proofErr w:type="spellStart"/>
+      <w:r>
+        <w:rPr>
+          <w:rFonts w:ascii="Times New Roman" w:hAnsi="Times New Roman" w:cs="Times New Roman"/>
+          <w:sz w:val="28"/>
+          <w:szCs w:val="28"/>
+        </w:rPr>
+        <w:t>GitVerse</w:t>
+      </w:r>
+      <w:proofErr w:type="spellEnd"/>
+      <w:r>
+        <w:rPr>
+          <w:rFonts w:ascii="Times New Roman" w:hAnsi="Times New Roman" w:cs="Times New Roman"/>
+          <w:sz w:val="28"/>
+          <w:szCs w:val="28"/>
+        </w:rPr>
+        <w:t xml:space="preserve">, написание документации проекта в </w:t>
+      </w:r>
+      <w:proofErr w:type="spellStart"/>
+      <w:r>
+        <w:rPr>
+          <w:rFonts w:ascii="Times New Roman" w:hAnsi="Times New Roman" w:cs="Times New Roman"/>
+          <w:sz w:val="28"/>
+          <w:szCs w:val="28"/>
+        </w:rPr>
+        <w:t>Markdown</w:t>
+      </w:r>
+      <w:proofErr w:type="spellEnd"/>
+      <w:r>
+        <w:rPr>
+          <w:rFonts w:ascii="Times New Roman" w:hAnsi="Times New Roman" w:cs="Times New Roman"/>
+          <w:sz w:val="28"/>
+          <w:szCs w:val="28"/>
+        </w:rPr>
+        <w:t xml:space="preserve">, разработка адаптивного веб-сайта, прохождение онлайн-курсов по LLM, участие в Карьерном марафоне и конференции </w:t>
+      </w:r>
+      <w:proofErr w:type="spellStart"/>
+      <w:r>
+        <w:rPr>
+          <w:rFonts w:ascii="Times New Roman" w:hAnsi="Times New Roman" w:cs="Times New Roman"/>
+          <w:sz w:val="28"/>
+          <w:szCs w:val="28"/>
+        </w:rPr>
+        <w:t>DataFest</w:t>
+      </w:r>
+      <w:proofErr w:type="spellEnd"/>
+      <w:r>
+        <w:rPr>
+          <w:rFonts w:ascii="Times New Roman" w:hAnsi="Times New Roman" w:cs="Times New Roman"/>
+          <w:sz w:val="28"/>
+          <w:szCs w:val="28"/>
+        </w:rPr>
+        <w:t xml:space="preserve"> 2026) и вариативной части по выбору. В качестве вариативной части было выбрано задание 2.2 — практическая реализация технологии HTTP-сервера «с нуля» на языке </w:t>
+      </w:r>
+      <w:proofErr w:type="spellStart"/>
+      <w:r>
+        <w:rPr>
+          <w:rFonts w:ascii="Times New Roman" w:hAnsi="Times New Roman" w:cs="Times New Roman"/>
+          <w:sz w:val="28"/>
+          <w:szCs w:val="28"/>
+        </w:rPr>
+        <w:t>Python</w:t>
+      </w:r>
+      <w:proofErr w:type="spellEnd"/>
+      <w:r>
+        <w:rPr>
+          <w:rFonts w:ascii="Times New Roman" w:hAnsi="Times New Roman" w:cs="Times New Roman"/>
+          <w:sz w:val="28"/>
+          <w:szCs w:val="28"/>
+        </w:rPr>
+        <w:t>.</w:t>
       </w:r>
     </w:p>
     <w:p>
@@ -919,6 +1093,7 @@
           <w:sz w:val="28"/>
           <w:szCs w:val="28"/>
         </w:rPr>
+        <w:lastRenderedPageBreak/>
         <w:t>Описание достигнутых результатов по проектной практике</w:t>
       </w:r>
     </w:p>
@@ -937,90 +1112,366 @@
       <w:r>
         <w:rPr>
           <w:rFonts w:ascii="Times New Roman" w:hAnsi="Times New Roman" w:cs="Times New Roman"/>
+          <w:sz w:val="28"/>
+          <w:szCs w:val="28"/>
         </w:rPr>
         <w:t>В ходе прохождения практики были достигнуты следующие результаты:</w:t>
       </w:r>
       <w:r>
         <w:rPr>
           <w:rFonts w:ascii="Times New Roman" w:hAnsi="Times New Roman" w:cs="Times New Roman"/>
+          <w:sz w:val="28"/>
+          <w:szCs w:val="28"/>
         </w:rPr>
         <w:br/>
       </w:r>
       <w:r>
         <w:rPr>
           <w:rFonts w:ascii="Times New Roman" w:hAnsi="Times New Roman" w:cs="Times New Roman"/>
+          <w:sz w:val="28"/>
+          <w:szCs w:val="28"/>
         </w:rPr>
         <w:br/>
-        <w:t>1. Методология и анализ данных (Студент Сангад</w:t>
-      </w:r>
-      <w:r>
-        <w:rPr>
-          <w:rFonts w:ascii="Times New Roman" w:hAnsi="Times New Roman" w:cs="Times New Roman"/>
-        </w:rPr>
-        <w:t>жиев М. Г.): Разработана многокритериальная анкета оценки ППС по 5 ключевым блокам (профессионализм, педагогическое мастерство, объективность, коммуникация, проектное руководство). Проведен статистический анализ сгенерированных ответов (1500 анкет), рассчи</w:t>
-      </w:r>
-      <w:r>
-        <w:rPr>
-          <w:rFonts w:ascii="Times New Roman" w:hAnsi="Times New Roman" w:cs="Times New Roman"/>
-        </w:rPr>
-        <w:t>таны средние значения рейтингов, дисперсия мнений и коэффициент корреляции Пирсона между оценками ППС и успеваемостью студентов. Полученные результаты интегрированы в дашборд.</w:t>
-      </w:r>
-      <w:r>
-        <w:rPr>
-          <w:rFonts w:ascii="Times New Roman" w:hAnsi="Times New Roman" w:cs="Times New Roman"/>
+        <w:t xml:space="preserve">1. Методология и анализ данных (Студент </w:t>
+      </w:r>
+      <w:proofErr w:type="spellStart"/>
+      <w:r>
+        <w:rPr>
+          <w:rFonts w:ascii="Times New Roman" w:hAnsi="Times New Roman" w:cs="Times New Roman"/>
+          <w:sz w:val="28"/>
+          <w:szCs w:val="28"/>
+        </w:rPr>
+        <w:t>Сангаджиев</w:t>
+      </w:r>
+      <w:proofErr w:type="spellEnd"/>
+      <w:r>
+        <w:rPr>
+          <w:rFonts w:ascii="Times New Roman" w:hAnsi="Times New Roman" w:cs="Times New Roman"/>
+          <w:sz w:val="28"/>
+          <w:szCs w:val="28"/>
+        </w:rPr>
+        <w:t xml:space="preserve"> М. Г.): Разработана многокритериальная анкета оценки ППС по 5 ключевым блокам (профессионализм, педагогическое мастерство, объективность, коммуникация, проектное руководство). Проведен статистический анализ сгенерированных ответов (1500 анкет), рассчитаны средние значения рейтингов, дисперсия мнений и коэффициент корреляции Пирсона между оценками ППС и успеваемостью студентов. Полученные результаты интегрированы в </w:t>
+      </w:r>
+      <w:proofErr w:type="spellStart"/>
+      <w:r>
+        <w:rPr>
+          <w:rFonts w:ascii="Times New Roman" w:hAnsi="Times New Roman" w:cs="Times New Roman"/>
+          <w:sz w:val="28"/>
+          <w:szCs w:val="28"/>
+        </w:rPr>
+        <w:t>дашборд</w:t>
+      </w:r>
+      <w:proofErr w:type="spellEnd"/>
+      <w:r>
+        <w:rPr>
+          <w:rFonts w:ascii="Times New Roman" w:hAnsi="Times New Roman" w:cs="Times New Roman"/>
+          <w:sz w:val="28"/>
+          <w:szCs w:val="28"/>
+        </w:rPr>
+        <w:t>.</w:t>
+      </w:r>
+      <w:r>
+        <w:rPr>
+          <w:rFonts w:ascii="Times New Roman" w:hAnsi="Times New Roman" w:cs="Times New Roman"/>
+          <w:sz w:val="28"/>
+          <w:szCs w:val="28"/>
         </w:rPr>
         <w:br/>
       </w:r>
       <w:r>
         <w:rPr>
           <w:rFonts w:ascii="Times New Roman" w:hAnsi="Times New Roman" w:cs="Times New Roman"/>
+          <w:sz w:val="28"/>
+          <w:szCs w:val="28"/>
         </w:rPr>
         <w:br/>
-        <w:t>2. Frontend-разработка (Смирнова Д. А.): Сверстан адаптивный веб-сайт проекта с</w:t>
-      </w:r>
-      <w:r>
-        <w:rPr>
-          <w:rFonts w:ascii="Times New Roman" w:hAnsi="Times New Roman" w:cs="Times New Roman"/>
-        </w:rPr>
-        <w:t xml:space="preserve"> использованием стиля Glassmorphism, темной цветовой гаммы и CSS-переходов. Интегрированы интерактивные диаграммы и профили преподавателей.</w:t>
-      </w:r>
-      <w:r>
-        <w:rPr>
-          <w:rFonts w:ascii="Times New Roman" w:hAnsi="Times New Roman" w:cs="Times New Roman"/>
+        <w:t xml:space="preserve">2. </w:t>
+      </w:r>
+      <w:proofErr w:type="spellStart"/>
+      <w:r>
+        <w:rPr>
+          <w:rFonts w:ascii="Times New Roman" w:hAnsi="Times New Roman" w:cs="Times New Roman"/>
+          <w:sz w:val="28"/>
+          <w:szCs w:val="28"/>
+        </w:rPr>
+        <w:t>Frontend</w:t>
+      </w:r>
+      <w:proofErr w:type="spellEnd"/>
+      <w:r>
+        <w:rPr>
+          <w:rFonts w:ascii="Times New Roman" w:hAnsi="Times New Roman" w:cs="Times New Roman"/>
+          <w:sz w:val="28"/>
+          <w:szCs w:val="28"/>
+        </w:rPr>
+        <w:t xml:space="preserve">-разработка (Смирнова Д. А.): Сверстан адаптивный веб-сайт проекта с использованием стиля </w:t>
+      </w:r>
+      <w:proofErr w:type="spellStart"/>
+      <w:r>
+        <w:rPr>
+          <w:rFonts w:ascii="Times New Roman" w:hAnsi="Times New Roman" w:cs="Times New Roman"/>
+          <w:sz w:val="28"/>
+          <w:szCs w:val="28"/>
+        </w:rPr>
+        <w:t>Glassmorphism</w:t>
+      </w:r>
+      <w:proofErr w:type="spellEnd"/>
+      <w:r>
+        <w:rPr>
+          <w:rFonts w:ascii="Times New Roman" w:hAnsi="Times New Roman" w:cs="Times New Roman"/>
+          <w:sz w:val="28"/>
+          <w:szCs w:val="28"/>
+        </w:rPr>
+        <w:t>, темной цветовой гаммы и CSS-переходов. Интегрированы интерактивные диаграммы и профили преподавателей.</w:t>
+      </w:r>
+      <w:r>
+        <w:rPr>
+          <w:rFonts w:ascii="Times New Roman" w:hAnsi="Times New Roman" w:cs="Times New Roman"/>
+          <w:sz w:val="28"/>
+          <w:szCs w:val="28"/>
         </w:rPr>
         <w:br/>
       </w:r>
       <w:r>
         <w:rPr>
           <w:rFonts w:ascii="Times New Roman" w:hAnsi="Times New Roman" w:cs="Times New Roman"/>
+          <w:sz w:val="28"/>
+          <w:szCs w:val="28"/>
         </w:rPr>
         <w:br/>
-        <w:t xml:space="preserve">3. Backend-разработка (Белов А. Д.): С нуля разработан многопоточный HTTP-сервер на Python с использованием модуля </w:t>
-      </w:r>
-      <w:r>
-        <w:rPr>
-          <w:rFonts w:ascii="Times New Roman" w:hAnsi="Times New Roman" w:cs="Times New Roman"/>
-        </w:rPr>
-        <w:t>socket. Реализован префиксный маршрутизатор (Trie Router), поддержка пула потоков (ThreadPool), сжатие ответов Gzip, кэширование (ETag) и частичная отдача файлов (Range Requests).</w:t>
-      </w:r>
-      <w:r>
-        <w:rPr>
-          <w:rFonts w:ascii="Times New Roman" w:hAnsi="Times New Roman" w:cs="Times New Roman"/>
+        <w:t xml:space="preserve">3. </w:t>
+      </w:r>
+      <w:proofErr w:type="spellStart"/>
+      <w:r>
+        <w:rPr>
+          <w:rFonts w:ascii="Times New Roman" w:hAnsi="Times New Roman" w:cs="Times New Roman"/>
+          <w:sz w:val="28"/>
+          <w:szCs w:val="28"/>
+        </w:rPr>
+        <w:t>Backend</w:t>
+      </w:r>
+      <w:proofErr w:type="spellEnd"/>
+      <w:r>
+        <w:rPr>
+          <w:rFonts w:ascii="Times New Roman" w:hAnsi="Times New Roman" w:cs="Times New Roman"/>
+          <w:sz w:val="28"/>
+          <w:szCs w:val="28"/>
+        </w:rPr>
+        <w:t xml:space="preserve">-разработка (Белов А. Д.): С нуля разработан многопоточный HTTP-сервер на </w:t>
+      </w:r>
+      <w:proofErr w:type="spellStart"/>
+      <w:r>
+        <w:rPr>
+          <w:rFonts w:ascii="Times New Roman" w:hAnsi="Times New Roman" w:cs="Times New Roman"/>
+          <w:sz w:val="28"/>
+          <w:szCs w:val="28"/>
+        </w:rPr>
+        <w:t>Python</w:t>
+      </w:r>
+      <w:proofErr w:type="spellEnd"/>
+      <w:r>
+        <w:rPr>
+          <w:rFonts w:ascii="Times New Roman" w:hAnsi="Times New Roman" w:cs="Times New Roman"/>
+          <w:sz w:val="28"/>
+          <w:szCs w:val="28"/>
+        </w:rPr>
+        <w:t xml:space="preserve"> с использованием модуля </w:t>
+      </w:r>
+      <w:proofErr w:type="spellStart"/>
+      <w:r>
+        <w:rPr>
+          <w:rFonts w:ascii="Times New Roman" w:hAnsi="Times New Roman" w:cs="Times New Roman"/>
+          <w:sz w:val="28"/>
+          <w:szCs w:val="28"/>
+        </w:rPr>
+        <w:t>socket</w:t>
+      </w:r>
+      <w:proofErr w:type="spellEnd"/>
+      <w:r>
+        <w:rPr>
+          <w:rFonts w:ascii="Times New Roman" w:hAnsi="Times New Roman" w:cs="Times New Roman"/>
+          <w:sz w:val="28"/>
+          <w:szCs w:val="28"/>
+        </w:rPr>
+        <w:t>. Реализован префиксный маршрутизатор (</w:t>
+      </w:r>
+      <w:proofErr w:type="spellStart"/>
+      <w:r>
+        <w:rPr>
+          <w:rFonts w:ascii="Times New Roman" w:hAnsi="Times New Roman" w:cs="Times New Roman"/>
+          <w:sz w:val="28"/>
+          <w:szCs w:val="28"/>
+        </w:rPr>
+        <w:t>Trie</w:t>
+      </w:r>
+      <w:proofErr w:type="spellEnd"/>
+      <w:r>
+        <w:rPr>
+          <w:rFonts w:ascii="Times New Roman" w:hAnsi="Times New Roman" w:cs="Times New Roman"/>
+          <w:sz w:val="28"/>
+          <w:szCs w:val="28"/>
+        </w:rPr>
+        <w:t xml:space="preserve"> </w:t>
+      </w:r>
+      <w:proofErr w:type="spellStart"/>
+      <w:r>
+        <w:rPr>
+          <w:rFonts w:ascii="Times New Roman" w:hAnsi="Times New Roman" w:cs="Times New Roman"/>
+          <w:sz w:val="28"/>
+          <w:szCs w:val="28"/>
+        </w:rPr>
+        <w:t>Router</w:t>
+      </w:r>
+      <w:proofErr w:type="spellEnd"/>
+      <w:r>
+        <w:rPr>
+          <w:rFonts w:ascii="Times New Roman" w:hAnsi="Times New Roman" w:cs="Times New Roman"/>
+          <w:sz w:val="28"/>
+          <w:szCs w:val="28"/>
+        </w:rPr>
+        <w:t>), поддержка пула потоков (</w:t>
+      </w:r>
+      <w:proofErr w:type="spellStart"/>
+      <w:r>
+        <w:rPr>
+          <w:rFonts w:ascii="Times New Roman" w:hAnsi="Times New Roman" w:cs="Times New Roman"/>
+          <w:sz w:val="28"/>
+          <w:szCs w:val="28"/>
+        </w:rPr>
+        <w:t>ThreadPool</w:t>
+      </w:r>
+      <w:proofErr w:type="spellEnd"/>
+      <w:r>
+        <w:rPr>
+          <w:rFonts w:ascii="Times New Roman" w:hAnsi="Times New Roman" w:cs="Times New Roman"/>
+          <w:sz w:val="28"/>
+          <w:szCs w:val="28"/>
+        </w:rPr>
+        <w:t xml:space="preserve">), сжатие ответов </w:t>
+      </w:r>
+      <w:proofErr w:type="spellStart"/>
+      <w:r>
+        <w:rPr>
+          <w:rFonts w:ascii="Times New Roman" w:hAnsi="Times New Roman" w:cs="Times New Roman"/>
+          <w:sz w:val="28"/>
+          <w:szCs w:val="28"/>
+        </w:rPr>
+        <w:t>Gzip</w:t>
+      </w:r>
+      <w:proofErr w:type="spellEnd"/>
+      <w:r>
+        <w:rPr>
+          <w:rFonts w:ascii="Times New Roman" w:hAnsi="Times New Roman" w:cs="Times New Roman"/>
+          <w:sz w:val="28"/>
+          <w:szCs w:val="28"/>
+        </w:rPr>
+        <w:t>, кэширование (</w:t>
+      </w:r>
+      <w:proofErr w:type="spellStart"/>
+      <w:r>
+        <w:rPr>
+          <w:rFonts w:ascii="Times New Roman" w:hAnsi="Times New Roman" w:cs="Times New Roman"/>
+          <w:sz w:val="28"/>
+          <w:szCs w:val="28"/>
+        </w:rPr>
+        <w:t>ETag</w:t>
+      </w:r>
+      <w:proofErr w:type="spellEnd"/>
+      <w:r>
+        <w:rPr>
+          <w:rFonts w:ascii="Times New Roman" w:hAnsi="Times New Roman" w:cs="Times New Roman"/>
+          <w:sz w:val="28"/>
+          <w:szCs w:val="28"/>
+        </w:rPr>
+        <w:t>) и частичная отдача файлов (</w:t>
+      </w:r>
+      <w:proofErr w:type="spellStart"/>
+      <w:r>
+        <w:rPr>
+          <w:rFonts w:ascii="Times New Roman" w:hAnsi="Times New Roman" w:cs="Times New Roman"/>
+          <w:sz w:val="28"/>
+          <w:szCs w:val="28"/>
+        </w:rPr>
+        <w:t>Range</w:t>
+      </w:r>
+      <w:proofErr w:type="spellEnd"/>
+      <w:r>
+        <w:rPr>
+          <w:rFonts w:ascii="Times New Roman" w:hAnsi="Times New Roman" w:cs="Times New Roman"/>
+          <w:sz w:val="28"/>
+          <w:szCs w:val="28"/>
+        </w:rPr>
+        <w:t xml:space="preserve"> </w:t>
+      </w:r>
+      <w:proofErr w:type="spellStart"/>
+      <w:r>
+        <w:rPr>
+          <w:rFonts w:ascii="Times New Roman" w:hAnsi="Times New Roman" w:cs="Times New Roman"/>
+          <w:sz w:val="28"/>
+          <w:szCs w:val="28"/>
+        </w:rPr>
+        <w:t>Requests</w:t>
+      </w:r>
+      <w:proofErr w:type="spellEnd"/>
+      <w:r>
+        <w:rPr>
+          <w:rFonts w:ascii="Times New Roman" w:hAnsi="Times New Roman" w:cs="Times New Roman"/>
+          <w:sz w:val="28"/>
+          <w:szCs w:val="28"/>
+        </w:rPr>
+        <w:t>).</w:t>
+      </w:r>
+      <w:r>
+        <w:rPr>
+          <w:rFonts w:ascii="Times New Roman" w:hAnsi="Times New Roman" w:cs="Times New Roman"/>
+          <w:sz w:val="28"/>
+          <w:szCs w:val="28"/>
         </w:rPr>
         <w:br/>
       </w:r>
       <w:r>
         <w:rPr>
           <w:rFonts w:ascii="Times New Roman" w:hAnsi="Times New Roman" w:cs="Times New Roman"/>
+          <w:sz w:val="28"/>
+          <w:szCs w:val="28"/>
         </w:rPr>
         <w:br/>
-        <w:t>4. DataFest 2026: Сангаджиев М. Г. принял участие в конференции, посетил до</w:t>
-      </w:r>
-      <w:r>
-        <w:rPr>
-          <w:rFonts w:ascii="Times New Roman" w:hAnsi="Times New Roman" w:cs="Times New Roman"/>
-        </w:rPr>
-        <w:t>клады по NLP и анализу текстов отзывов, применив полученные знания для концептуального проектирования модуля разметки комментариев студентов.</w:t>
+        <w:t xml:space="preserve">4. </w:t>
+      </w:r>
+      <w:proofErr w:type="spellStart"/>
+      <w:r>
+        <w:rPr>
+          <w:rFonts w:ascii="Times New Roman" w:hAnsi="Times New Roman" w:cs="Times New Roman"/>
+          <w:sz w:val="28"/>
+          <w:szCs w:val="28"/>
+        </w:rPr>
+        <w:t>DataFest</w:t>
+      </w:r>
+      <w:proofErr w:type="spellEnd"/>
+      <w:r>
+        <w:rPr>
+          <w:rFonts w:ascii="Times New Roman" w:hAnsi="Times New Roman" w:cs="Times New Roman"/>
+          <w:sz w:val="28"/>
+          <w:szCs w:val="28"/>
+        </w:rPr>
+        <w:t xml:space="preserve"> 2026: </w:t>
+      </w:r>
+      <w:proofErr w:type="spellStart"/>
+      <w:r>
+        <w:rPr>
+          <w:rFonts w:ascii="Times New Roman" w:hAnsi="Times New Roman" w:cs="Times New Roman"/>
+          <w:sz w:val="28"/>
+          <w:szCs w:val="28"/>
+        </w:rPr>
+        <w:t>Сангаджиев</w:t>
+      </w:r>
+      <w:proofErr w:type="spellEnd"/>
+      <w:r>
+        <w:rPr>
+          <w:rFonts w:ascii="Times New Roman" w:hAnsi="Times New Roman" w:cs="Times New Roman"/>
+          <w:sz w:val="28"/>
+          <w:szCs w:val="28"/>
+        </w:rPr>
+        <w:t xml:space="preserve"> М. Г. принял участие в конференции, посетил доклады по NLP и анализу текстов отзывов, применив полученные знания для концептуального проектирования модуля разметки комментариев студентов.</w:t>
       </w:r>
     </w:p>
     <w:p>
@@ -1050,60 +1501,75 @@
       <w:pPr>
         <w:rPr>
           <w:rFonts w:ascii="Times New Roman" w:hAnsi="Times New Roman" w:cs="Times New Roman"/>
-        </w:rPr>
-      </w:pPr>
-      <w:r>
-        <w:rPr>
-          <w:rFonts w:ascii="Times New Roman" w:hAnsi="Times New Roman" w:cs="Times New Roman"/>
-        </w:rPr>
-        <w:t xml:space="preserve">В ходе </w:t>
-      </w:r>
-      <w:r>
-        <w:rPr>
-          <w:rFonts w:ascii="Times New Roman" w:hAnsi="Times New Roman" w:cs="Times New Roman"/>
-        </w:rPr>
-        <w:t>проектной практики были успешно решены все поставленные цели и задачи. Разработанный веб-ориентированный программный комплекс социологического мониторинга ППС демонстрирует высокую стабильность и скорость работы при обслуживании статических ресурсов и обра</w:t>
-      </w:r>
-      <w:r>
-        <w:rPr>
-          <w:rFonts w:ascii="Times New Roman" w:hAnsi="Times New Roman" w:cs="Times New Roman"/>
-        </w:rPr>
-        <w:t>ботке API-запросов благодаря собственному легковесному HTTP-серверу.</w:t>
-      </w:r>
-      <w:r>
-        <w:rPr>
-          <w:rFonts w:ascii="Times New Roman" w:hAnsi="Times New Roman" w:cs="Times New Roman"/>
+          <w:sz w:val="28"/>
+          <w:szCs w:val="28"/>
+        </w:rPr>
+      </w:pPr>
+      <w:r>
+        <w:rPr>
+          <w:rFonts w:ascii="Times New Roman" w:hAnsi="Times New Roman" w:cs="Times New Roman"/>
+          <w:sz w:val="28"/>
+          <w:szCs w:val="28"/>
+        </w:rPr>
+        <w:t>В ходе проектной практики были успешно решены все поставленные цели и задачи. Разработанный веб-ориентированный программный комплекс социологического мониторинга ППС демонстрирует высокую стабильность и скорость работы при обслуживании статических ресурсов и обработке API-запросов благодаря собственному легковесному HTTP-серверу.</w:t>
+      </w:r>
+      <w:r>
+        <w:rPr>
+          <w:rFonts w:ascii="Times New Roman" w:hAnsi="Times New Roman" w:cs="Times New Roman"/>
+          <w:sz w:val="28"/>
+          <w:szCs w:val="28"/>
         </w:rPr>
         <w:br/>
       </w:r>
       <w:r>
         <w:rPr>
           <w:rFonts w:ascii="Times New Roman" w:hAnsi="Times New Roman" w:cs="Times New Roman"/>
+          <w:sz w:val="28"/>
+          <w:szCs w:val="28"/>
         </w:rPr>
         <w:br/>
-      </w:r>
-      <w:r>
-        <w:rPr>
-          <w:rFonts w:ascii="Times New Roman" w:hAnsi="Times New Roman" w:cs="Times New Roman"/>
+        <w:t xml:space="preserve">Ценность проекта для заказчика заключается в автоматизации сбора обратной </w:t>
+      </w:r>
+      <w:r>
+        <w:rPr>
+          <w:rFonts w:ascii="Times New Roman" w:hAnsi="Times New Roman" w:cs="Times New Roman"/>
+          <w:sz w:val="28"/>
+          <w:szCs w:val="28"/>
         </w:rPr>
         <w:lastRenderedPageBreak/>
-        <w:t xml:space="preserve">Ценность проекта для заказчика заключается в автоматизации сбора обратной связи студентов, ускорении расчета рейтингов и предоставлении наглядных BI-дашбордов для принятия своевременных </w:t>
-      </w:r>
-      <w:r>
-        <w:rPr>
-          <w:rFonts w:ascii="Times New Roman" w:hAnsi="Times New Roman" w:cs="Times New Roman"/>
-        </w:rPr>
-        <w:t>кадровых и учебно-методических решений.</w:t>
-      </w:r>
-      <w:r>
-        <w:rPr>
-          <w:rFonts w:ascii="Times New Roman" w:hAnsi="Times New Roman" w:cs="Times New Roman"/>
+        <w:t>связи студентов, ускорении расчета рейтингов и предоставлении наглядных BI-</w:t>
+      </w:r>
+      <w:proofErr w:type="spellStart"/>
+      <w:r>
+        <w:rPr>
+          <w:rFonts w:ascii="Times New Roman" w:hAnsi="Times New Roman" w:cs="Times New Roman"/>
+          <w:sz w:val="28"/>
+          <w:szCs w:val="28"/>
+        </w:rPr>
+        <w:t>дашбордов</w:t>
+      </w:r>
+      <w:proofErr w:type="spellEnd"/>
+      <w:r>
+        <w:rPr>
+          <w:rFonts w:ascii="Times New Roman" w:hAnsi="Times New Roman" w:cs="Times New Roman"/>
+          <w:sz w:val="28"/>
+          <w:szCs w:val="28"/>
+        </w:rPr>
+        <w:t xml:space="preserve"> для принятия своевременных кадровых и учебно-методических решений.</w:t>
+      </w:r>
+      <w:r>
+        <w:rPr>
+          <w:rFonts w:ascii="Times New Roman" w:hAnsi="Times New Roman" w:cs="Times New Roman"/>
+          <w:sz w:val="28"/>
+          <w:szCs w:val="28"/>
         </w:rPr>
         <w:br/>
       </w:r>
       <w:r>
         <w:rPr>
           <w:rFonts w:ascii="Times New Roman" w:hAnsi="Times New Roman" w:cs="Times New Roman"/>
+          <w:sz w:val="28"/>
+          <w:szCs w:val="28"/>
         </w:rPr>
         <w:br/>
         <w:t>По результатам выполнения всех этапов работы практика оценивается на «Отлично».</w:t>
@@ -1135,66 +1601,224 @@
       <w:pPr>
         <w:rPr>
           <w:rFonts w:ascii="Times New Roman" w:hAnsi="Times New Roman" w:cs="Times New Roman"/>
-        </w:rPr>
-      </w:pPr>
-      <w:r>
-        <w:rPr>
-          <w:rFonts w:ascii="Times New Roman" w:hAnsi="Times New Roman" w:cs="Times New Roman"/>
-        </w:rPr>
-        <w:t>1. ГОСТ 7.32-2017. Система стандартов по информации, библиотечному и издательскому делу. Отчет о научн</w:t>
-      </w:r>
-      <w:r>
-        <w:rPr>
-          <w:rFonts w:ascii="Times New Roman" w:hAnsi="Times New Roman" w:cs="Times New Roman"/>
-        </w:rPr>
-        <w:t>о-исследовательской работе. Структура и правила оформления.</w:t>
-      </w:r>
-      <w:r>
-        <w:rPr>
-          <w:rFonts w:ascii="Times New Roman" w:hAnsi="Times New Roman" w:cs="Times New Roman"/>
+          <w:sz w:val="28"/>
+          <w:szCs w:val="28"/>
+        </w:rPr>
+      </w:pPr>
+      <w:r>
+        <w:rPr>
+          <w:rFonts w:ascii="Times New Roman" w:hAnsi="Times New Roman" w:cs="Times New Roman"/>
+          <w:sz w:val="28"/>
+          <w:szCs w:val="28"/>
+        </w:rPr>
+        <w:t>1. ГОСТ 7.32-2017. Система стандартов по информации, библиотечному и издательскому делу. Отчет о научно-исследовательской работе. Структура и правила оформления.</w:t>
+      </w:r>
+      <w:r>
+        <w:rPr>
+          <w:rFonts w:ascii="Times New Roman" w:hAnsi="Times New Roman" w:cs="Times New Roman"/>
+          <w:sz w:val="28"/>
+          <w:szCs w:val="28"/>
         </w:rPr>
         <w:br/>
-        <w:t>2. Луцков М. В. Сетевое программирование на сокетах в Python. — М.: ДМК Пресс, 2021. — 312 с.</w:t>
-      </w:r>
-      <w:r>
-        <w:rPr>
-          <w:rFonts w:ascii="Times New Roman" w:hAnsi="Times New Roman" w:cs="Times New Roman"/>
+        <w:t xml:space="preserve">2. </w:t>
+      </w:r>
+      <w:proofErr w:type="spellStart"/>
+      <w:r>
+        <w:rPr>
+          <w:rFonts w:ascii="Times New Roman" w:hAnsi="Times New Roman" w:cs="Times New Roman"/>
+          <w:sz w:val="28"/>
+          <w:szCs w:val="28"/>
+        </w:rPr>
+        <w:t>Луцков</w:t>
+      </w:r>
+      <w:proofErr w:type="spellEnd"/>
+      <w:r>
+        <w:rPr>
+          <w:rFonts w:ascii="Times New Roman" w:hAnsi="Times New Roman" w:cs="Times New Roman"/>
+          <w:sz w:val="28"/>
+          <w:szCs w:val="28"/>
+        </w:rPr>
+        <w:t xml:space="preserve"> М. В. Сетевое программирование на сокетах в </w:t>
+      </w:r>
+      <w:proofErr w:type="spellStart"/>
+      <w:r>
+        <w:rPr>
+          <w:rFonts w:ascii="Times New Roman" w:hAnsi="Times New Roman" w:cs="Times New Roman"/>
+          <w:sz w:val="28"/>
+          <w:szCs w:val="28"/>
+        </w:rPr>
+        <w:t>Python</w:t>
+      </w:r>
+      <w:proofErr w:type="spellEnd"/>
+      <w:r>
+        <w:rPr>
+          <w:rFonts w:ascii="Times New Roman" w:hAnsi="Times New Roman" w:cs="Times New Roman"/>
+          <w:sz w:val="28"/>
+          <w:szCs w:val="28"/>
+        </w:rPr>
+        <w:t>. — М.: ДМК Пресс, 2021. — 312 с.</w:t>
+      </w:r>
+      <w:r>
+        <w:rPr>
+          <w:rFonts w:ascii="Times New Roman" w:hAnsi="Times New Roman" w:cs="Times New Roman"/>
+          <w:sz w:val="28"/>
+          <w:szCs w:val="28"/>
         </w:rPr>
         <w:br/>
-        <w:t>3. Флэнаган Д. JavaScript: Полное руководство. — СПб.: Символ-Плюс, 2020. — 1008 с.</w:t>
-      </w:r>
-      <w:r>
-        <w:rPr>
-          <w:rFonts w:ascii="Times New Roman" w:hAnsi="Times New Roman" w:cs="Times New Roman"/>
+        <w:t xml:space="preserve">3. </w:t>
+      </w:r>
+      <w:proofErr w:type="spellStart"/>
+      <w:r>
+        <w:rPr>
+          <w:rFonts w:ascii="Times New Roman" w:hAnsi="Times New Roman" w:cs="Times New Roman"/>
+          <w:sz w:val="28"/>
+          <w:szCs w:val="28"/>
+        </w:rPr>
+        <w:t>Флэнаган</w:t>
+      </w:r>
+      <w:proofErr w:type="spellEnd"/>
+      <w:r>
+        <w:rPr>
+          <w:rFonts w:ascii="Times New Roman" w:hAnsi="Times New Roman" w:cs="Times New Roman"/>
+          <w:sz w:val="28"/>
+          <w:szCs w:val="28"/>
+        </w:rPr>
+        <w:t xml:space="preserve"> Д. </w:t>
+      </w:r>
+      <w:proofErr w:type="spellStart"/>
+      <w:r>
+        <w:rPr>
+          <w:rFonts w:ascii="Times New Roman" w:hAnsi="Times New Roman" w:cs="Times New Roman"/>
+          <w:sz w:val="28"/>
+          <w:szCs w:val="28"/>
+        </w:rPr>
+        <w:t>JavaScript</w:t>
+      </w:r>
+      <w:proofErr w:type="spellEnd"/>
+      <w:r>
+        <w:rPr>
+          <w:rFonts w:ascii="Times New Roman" w:hAnsi="Times New Roman" w:cs="Times New Roman"/>
+          <w:sz w:val="28"/>
+          <w:szCs w:val="28"/>
+        </w:rPr>
+        <w:t>: Полное руководство. — СПб.: Символ-Плюс, 2020. — 1008 с.</w:t>
+      </w:r>
+      <w:r>
+        <w:rPr>
+          <w:rFonts w:ascii="Times New Roman" w:hAnsi="Times New Roman" w:cs="Times New Roman"/>
+          <w:sz w:val="28"/>
+          <w:szCs w:val="28"/>
         </w:rPr>
         <w:br/>
-        <w:t>4. Ядов В. А. Стра</w:t>
-      </w:r>
-      <w:r>
-        <w:rPr>
-          <w:rFonts w:ascii="Times New Roman" w:hAnsi="Times New Roman" w:cs="Times New Roman"/>
-        </w:rPr>
-        <w:t>тегия социологического исследования. Описание, объяснение, понимание социальной реальности. — М.: Академкнига, 2018. — 567 с.</w:t>
-      </w:r>
-      <w:r>
-        <w:rPr>
-          <w:rFonts w:ascii="Times New Roman" w:hAnsi="Times New Roman" w:cs="Times New Roman"/>
+        <w:t>4. Ядов В. А. Стратегия социологического исследования. Описание, объяснение, понимание социальной реальности. — М.: Академкнига, 2018. — 567 с.</w:t>
+      </w:r>
+      <w:r>
+        <w:rPr>
+          <w:rFonts w:ascii="Times New Roman" w:hAnsi="Times New Roman" w:cs="Times New Roman"/>
+          <w:sz w:val="28"/>
+          <w:szCs w:val="28"/>
         </w:rPr>
         <w:br/>
-        <w:t>5. Официальная документация Python: модуль socket [Электронный ресурс]. URL: https://docs.python.org/3/library/socket.html</w:t>
-      </w:r>
-      <w:r>
-        <w:rPr>
-          <w:rFonts w:ascii="Times New Roman" w:hAnsi="Times New Roman" w:cs="Times New Roman"/>
+        <w:t xml:space="preserve">5. Официальная документация </w:t>
+      </w:r>
+      <w:proofErr w:type="spellStart"/>
+      <w:r>
+        <w:rPr>
+          <w:rFonts w:ascii="Times New Roman" w:hAnsi="Times New Roman" w:cs="Times New Roman"/>
+          <w:sz w:val="28"/>
+          <w:szCs w:val="28"/>
+        </w:rPr>
+        <w:t>Python</w:t>
+      </w:r>
+      <w:proofErr w:type="spellEnd"/>
+      <w:r>
+        <w:rPr>
+          <w:rFonts w:ascii="Times New Roman" w:hAnsi="Times New Roman" w:cs="Times New Roman"/>
+          <w:sz w:val="28"/>
+          <w:szCs w:val="28"/>
+        </w:rPr>
+        <w:t xml:space="preserve">: модуль </w:t>
+      </w:r>
+      <w:proofErr w:type="spellStart"/>
+      <w:r>
+        <w:rPr>
+          <w:rFonts w:ascii="Times New Roman" w:hAnsi="Times New Roman" w:cs="Times New Roman"/>
+          <w:sz w:val="28"/>
+          <w:szCs w:val="28"/>
+        </w:rPr>
+        <w:t>socket</w:t>
+      </w:r>
+      <w:proofErr w:type="spellEnd"/>
+      <w:r>
+        <w:rPr>
+          <w:rFonts w:ascii="Times New Roman" w:hAnsi="Times New Roman" w:cs="Times New Roman"/>
+          <w:sz w:val="28"/>
+          <w:szCs w:val="28"/>
+        </w:rPr>
+        <w:t xml:space="preserve"> [Электронный ресурс]. URL: https://docs.python.org/3/library/socket.html</w:t>
+      </w:r>
+      <w:r>
+        <w:rPr>
+          <w:rFonts w:ascii="Times New Roman" w:hAnsi="Times New Roman" w:cs="Times New Roman"/>
+          <w:sz w:val="28"/>
+          <w:szCs w:val="28"/>
         </w:rPr>
         <w:br/>
         <w:t xml:space="preserve">6. MDN </w:t>
       </w:r>
-      <w:r>
-        <w:rPr>
-          <w:rFonts w:ascii="Times New Roman" w:hAnsi="Times New Roman" w:cs="Times New Roman"/>
-        </w:rPr>
-        <w:t>Web Docs: HTTP Protocol [Электронный ресурс]. URL: https://developer.mozilla.org/ru/docs/Web/HTTP</w:t>
+      <w:proofErr w:type="spellStart"/>
+      <w:r>
+        <w:rPr>
+          <w:rFonts w:ascii="Times New Roman" w:hAnsi="Times New Roman" w:cs="Times New Roman"/>
+          <w:sz w:val="28"/>
+          <w:szCs w:val="28"/>
+        </w:rPr>
+        <w:t>Web</w:t>
+      </w:r>
+      <w:proofErr w:type="spellEnd"/>
+      <w:r>
+        <w:rPr>
+          <w:rFonts w:ascii="Times New Roman" w:hAnsi="Times New Roman" w:cs="Times New Roman"/>
+          <w:sz w:val="28"/>
+          <w:szCs w:val="28"/>
+        </w:rPr>
+        <w:t xml:space="preserve"> </w:t>
+      </w:r>
+      <w:proofErr w:type="spellStart"/>
+      <w:r>
+        <w:rPr>
+          <w:rFonts w:ascii="Times New Roman" w:hAnsi="Times New Roman" w:cs="Times New Roman"/>
+          <w:sz w:val="28"/>
+          <w:szCs w:val="28"/>
+        </w:rPr>
+        <w:t>Docs</w:t>
+      </w:r>
+      <w:proofErr w:type="spellEnd"/>
+      <w:r>
+        <w:rPr>
+          <w:rFonts w:ascii="Times New Roman" w:hAnsi="Times New Roman" w:cs="Times New Roman"/>
+          <w:sz w:val="28"/>
+          <w:szCs w:val="28"/>
+        </w:rPr>
+        <w:t xml:space="preserve">: HTTP </w:t>
+      </w:r>
+      <w:proofErr w:type="spellStart"/>
+      <w:r>
+        <w:rPr>
+          <w:rFonts w:ascii="Times New Roman" w:hAnsi="Times New Roman" w:cs="Times New Roman"/>
+          <w:sz w:val="28"/>
+          <w:szCs w:val="28"/>
+        </w:rPr>
+        <w:t>Protocol</w:t>
+      </w:r>
+      <w:proofErr w:type="spellEnd"/>
+      <w:r>
+        <w:rPr>
+          <w:rFonts w:ascii="Times New Roman" w:hAnsi="Times New Roman" w:cs="Times New Roman"/>
+          <w:sz w:val="28"/>
+          <w:szCs w:val="28"/>
+        </w:rPr>
+        <w:t xml:space="preserve"> [Электронный ресурс]. URL: https://developer.mozilla.org/ru/docs/Web/HTTP</w:t>
       </w:r>
     </w:p>
     <w:p>
@@ -1945,6 +2569,7 @@
     <w:lsdException w:name="HTML Sample" w:semiHidden="1" w:unhideWhenUsed="1"/>
     <w:lsdException w:name="HTML Typewriter" w:semiHidden="1" w:unhideWhenUsed="1"/>
     <w:lsdException w:name="HTML Variable" w:semiHidden="1" w:unhideWhenUsed="1"/>
+    <w:lsdException w:name="Normal Table" w:semiHidden="1" w:unhideWhenUsed="1"/>
     <w:lsdException w:name="annotation subject" w:semiHidden="1" w:unhideWhenUsed="1"/>
     <w:lsdException w:name="No List" w:semiHidden="1" w:unhideWhenUsed="1"/>
     <w:lsdException w:name="Outline List 1" w:semiHidden="1" w:unhideWhenUsed="1"/>
@@ -1987,8 +2612,11 @@
     <w:lsdException w:name="Table Contemporary" w:semiHidden="1" w:unhideWhenUsed="1"/>
     <w:lsdException w:name="Table Elegant" w:semiHidden="1" w:unhideWhenUsed="1"/>
     <w:lsdException w:name="Table Professional" w:semiHidden="1" w:unhideWhenUsed="1"/>
+    <w:lsdException w:name="Table Subtle 1" w:semiHidden="1" w:unhideWhenUsed="1"/>
     <w:lsdException w:name="Table Subtle 2" w:semiHidden="1" w:unhideWhenUsed="1"/>
     <w:lsdException w:name="Table Web 1" w:semiHidden="1" w:unhideWhenUsed="1"/>
+    <w:lsdException w:name="Table Web 2" w:semiHidden="1" w:unhideWhenUsed="1"/>
+    <w:lsdException w:name="Table Web 3" w:semiHidden="1" w:unhideWhenUsed="1"/>
     <w:lsdException w:name="Balloon Text" w:semiHidden="1" w:unhideWhenUsed="1"/>
     <w:lsdException w:name="Table Grid" w:uiPriority="39"/>
     <w:lsdException w:name="Table Theme" w:semiHidden="1" w:unhideWhenUsed="1"/>

</xml_diff>